<commit_message>
Drukmeting consistent over alle documenten; 09b versie 1.3 lean
09b 1.3: op basis van Janou's bewerking herschikt (eenmalig, dan de meting
in volgorde, achtergrond achteraan), verantwoording en bronnummers uit de
tekst, doelregio's volgens het manuscript (hiel alleen bij vorige
voetzweer), rol van eCRF 24b. Pressure Monitoring Tool: blad Visit en
sjabloon naar acht regio's (codes A-P), pedar-zolen als figuur, hielregel;
tool nu ook in Per visite V1/V2/V4/V6/V8. eCRF 24b: hielregel.
Referentie visite 2 i.p.v. "dezelfde sessie" in manuscript, doctoraatsplan,
opleidingsplanning, WP1-afvinklijst, Groeninge- en congresdeck (+ scripts),
werkpakket1-tijdlijn. Toestemmingsformulier (eCRF 02 x3, model-ICF): meting
in de schoen, beide armen gemeten, herhaling op maand 6/12/18. REDCap:
drie snelheidsvelden weg (1410 velden), toelichting referentie. Geen
netwerkdatabase. PARADISE_BRONNEN bijgewerkt.

Co-Authored-By: Claude Opus 5.5 <noreply@anthropic.com>
</commit_message>
<xml_diff>
--- a/(e)CRF/Per nummer/02_Toestemmingsformulier en kostenformulier (patient).docx
+++ b/(e)CRF/Per nummer/02_Toestemmingsformulier en kostenformulier (patient).docx
@@ -2887,7 +2887,7 @@
           <w:szCs w:val="20"/>
           <w:lang w:val="nl-NL"/>
         </w:rPr>
-        <w:t>Indien</w:t>
+        <w:t>In beide groepen wordt de druk onder uw voeten gemeten terwijl u schoenen draagt, wordt er een kleine sensor in uw steunzool geplaatst die bijhoudt hoe vaak u uw schoenen draagt, en draagt u op twee momenten gedurende één week een klein toestel dat uw activiteiten meet (bv. traplopen, stappen, zitten). Indien u wordt toegewezen aan de groep die de PARADISE-aanpak ontvangt, worden de resultaten van de drukmeting gebruikt om uw steunzolen bij te sturen.</w:t>
       </w:r>
       <w:proofErr w:type="gramEnd"/>
       <w:r>
@@ -2897,7 +2897,6 @@
           <w:szCs w:val="20"/>
           <w:lang w:val="nl-NL"/>
         </w:rPr>
-        <w:t xml:space="preserve"> u wordt toegewezen aan de groep die de PARADISE-aanpak ontvangt, zullen bijkomende metingen </w:t>
       </w:r>
       <w:r>
         <w:rPr>
@@ -2905,7 +2904,6 @@
           <w:szCs w:val="20"/>
           <w:lang w:val="nl-NL"/>
         </w:rPr>
-        <w:t>worden uitgevoerd</w:t>
       </w:r>
       <w:r>
         <w:rPr>
@@ -2914,7 +2912,6 @@
           <w:szCs w:val="20"/>
           <w:lang w:val="nl-NL"/>
         </w:rPr>
-        <w:t xml:space="preserve">. Zo zal onder andere de druk onder uw voeten gemeten worden terwijl u schoenen draagt, zal een kleine sensor in uw zool geplaatst worden om na te gaan hoe vaak u uw schoenen draagt, en zal u gedurende een korte periode een </w:t>
       </w:r>
       <w:r>
         <w:rPr>
@@ -2922,7 +2919,6 @@
           <w:szCs w:val="20"/>
           <w:lang w:val="nl-NL"/>
         </w:rPr>
-        <w:t xml:space="preserve">klein toestel dragen </w:t>
       </w:r>
       <w:r>
         <w:rPr>
@@ -2931,7 +2927,6 @@
           <w:szCs w:val="20"/>
           <w:lang w:val="nl-NL"/>
         </w:rPr>
-        <w:t>om uw</w:t>
       </w:r>
       <w:r>
         <w:rPr>
@@ -2939,7 +2934,6 @@
           <w:szCs w:val="20"/>
           <w:lang w:val="nl-NL"/>
         </w:rPr>
-        <w:t xml:space="preserve"> </w:t>
       </w:r>
       <w:r>
         <w:rPr>
@@ -2947,7 +2941,6 @@
           <w:szCs w:val="20"/>
           <w:lang w:val="nl-NL"/>
         </w:rPr>
-        <w:t>activiteiten (</w:t>
       </w:r>
       <w:r>
         <w:rPr>
@@ -2955,7 +2948,6 @@
           <w:szCs w:val="20"/>
           <w:lang w:val="nl-NL"/>
         </w:rPr>
-        <w:t xml:space="preserve">bv. </w:t>
       </w:r>
       <w:r>
         <w:rPr>
@@ -2963,7 +2955,6 @@
           <w:szCs w:val="20"/>
           <w:lang w:val="nl-NL"/>
         </w:rPr>
-        <w:t>t</w:t>
       </w:r>
       <w:r>
         <w:rPr>
@@ -2971,7 +2962,6 @@
           <w:szCs w:val="20"/>
           <w:lang w:val="nl-NL"/>
         </w:rPr>
-        <w:t>raplopen, stappen, zitten)</w:t>
       </w:r>
       <w:r>
         <w:rPr>
@@ -2979,7 +2969,6 @@
           <w:szCs w:val="20"/>
           <w:lang w:val="nl-NL"/>
         </w:rPr>
-        <w:t xml:space="preserve"> </w:t>
       </w:r>
       <w:r>
         <w:rPr>
@@ -2988,7 +2977,6 @@
           <w:szCs w:val="20"/>
           <w:lang w:val="nl-NL"/>
         </w:rPr>
-        <w:t xml:space="preserve">te </w:t>
       </w:r>
       <w:r>
         <w:rPr>
@@ -2997,7 +2985,6 @@
           <w:szCs w:val="20"/>
           <w:lang w:val="nl-NL"/>
         </w:rPr>
-        <w:t>meten.</w:t>
       </w:r>
       <w:r>
         <w:rPr>
@@ -3413,7 +3400,7 @@
           <w:szCs w:val="20"/>
           <w:lang w:val="nl-BE"/>
         </w:rPr>
-        <w:t>Daarna wordt de druk onder uw voeten gemeten. Dit gebeurt terwijl u blootsvoets stapt op een speciale meetplaat (Figuur 1). Deze metingen tonen op welke plaatsen onder uw voet meer druk ontstaat. De resultaten helpen om uw steunzolen zo goed mogelijk aan te passen.</w:t>
+        <w:t>Daarna wordt de druk onder uw voeten gemeten. Daarvoor legt de zorgverlener een dunne meetzool in uw schoen, en wordt er een klein zendertje met een klittenband aan uw onderbeen vastgemaakt. U wandelt dan enkele keren een korte afstand op uw gewone snelheid, in de schoenen waarmee u naar de afspraak komt (Figuur 1). Deze metingen tonen op welke plaatsen onder uw voet meer druk ontstaat. De resultaten helpen om uw steunzolen zo goed mogelijk aan te passen.</w:t>
       </w:r>
     </w:p>
     <w:p>
@@ -4390,6 +4377,39 @@
           <w:lang w:val="nl-BE"/>
         </w:rPr>
         <w:t xml:space="preserve"> we de gegevens van de sensoren uit; </w:t>
+      </w:r>
+    </w:p>
+    <w:p>
+      <w:pPr>
+        <w:pStyle w:val="Lijstalinea"/>
+        <w:numPr>
+          <w:ilvl w:val="0"/>
+          <w:numId w:val="2"/>
+        </w:numPr>
+        <w:jc w:val="both"/>
+        <w:rPr>
+          <w:sz w:val="20"/>
+          <w:szCs w:val="20"/>
+          <w:lang w:val="nl-BE"/>
+        </w:rPr>
+      </w:pPr>
+      <w:proofErr w:type="gramStart"/>
+      <w:r>
+        <w:rPr>
+          <w:sz w:val="20"/>
+          <w:szCs w:val="20"/>
+          <w:lang w:val="nl-BE"/>
+        </w:rPr>
+        <w:t>meten we na 6, 12 en 18 maanden opnieuw de druk onder uw voeten, met en zonder de steunzolen;</w:t>
+      </w:r>
+      <w:proofErr w:type="gramEnd"/>
+      <w:r>
+        <w:rPr>
+          <w:sz w:val="20"/>
+          <w:szCs w:val="20"/>
+          <w:lang w:val="nl-BE"/>
+        </w:rPr>
+        <w:t xml:space="preserve"> </w:t>
       </w:r>
     </w:p>
     <w:p>

</xml_diff>

<commit_message>
ICF en MoveMonitor-handleiding: drukmeting na aflevering en op 12 en 18 maanden alleen in de PARADISE-groep, Usual Care na 6 maanden; activiteitssensor alleen bij de start (model-ICF als bijgehouden wijzigingen)
Co-Authored-By: Claude Opus 5.5 <noreply@anthropic.com>
</commit_message>
<xml_diff>
--- a/(e)CRF/Per nummer/02_Toestemmingsformulier en kostenformulier (patient).docx
+++ b/(e)CRF/Per nummer/02_Toestemmingsformulier en kostenformulier (patient).docx
@@ -2887,7 +2887,7 @@
           <w:szCs w:val="20"/>
           <w:lang w:val="nl-NL"/>
         </w:rPr>
-        <w:t>In beide groepen wordt de druk onder uw voeten gemeten terwijl u schoenen draagt, wordt er een kleine sensor in uw steunzool geplaatst die bijhoudt hoe vaak u uw schoenen draagt, en draagt u op twee momenten gedurende één week een klein toestel dat uw activiteiten meet (bv. traplopen, stappen, zitten). Indien u wordt toegewezen aan de groep die de PARADISE-aanpak ontvangt, worden de resultaten van de drukmeting gebruikt om uw steunzolen bij te sturen.</w:t>
+        <w:t>In beide groepen wordt de druk onder uw voeten gemeten terwijl u schoenen draagt, wordt er een kleine sensor in uw steunzool geplaatst die bijhoudt hoe vaak u uw schoenen draagt, en draagt u bij de start gedurende één week een klein toestel dat uw activiteiten meet (bv. traplopen, stappen, zitten). Indien u wordt toegewezen aan de groep die de PARADISE-aanpak ontvangt, worden de resultaten van de drukmeting gebruikt om uw steunzolen bij te sturen.</w:t>
       </w:r>
       <w:proofErr w:type="gramEnd"/>
       <w:r>
@@ -3419,7 +3419,7 @@
           <w:szCs w:val="20"/>
           <w:lang w:val="nl-BE"/>
         </w:rPr>
-        <w:t>Tijdens een volgend bezoek worden uw steunzolen aangemeten (Figuur 2). We controleren of deze goed passen en comfortabel zitten. Vervolgens meten we opnieuw de druk onder uw voeten terwijl u uw eigen schoenen draagt, met en zonder de steunzolen. Indien nodig worden uw steunzolen of schoeisel aangepast om de druk onder uw voeten zoveel mogelijk te verminderen.</w:t>
+        <w:t>Tijdens een volgend bezoek worden uw steunzolen aangemeten (Figuur 2). We controleren of deze goed passen en comfortabel zitten. In de groep die de PARADISE-aanpak ontvangt, meten we vervolgens opnieuw de druk onder uw voeten terwijl u uw eigen schoenen draagt, met en zonder de steunzolen, en worden uw steunzolen of schoeisel indien nodig aangepast om de druk onder uw voeten zoveel mogelijk te verminderen.</w:t>
       </w:r>
     </w:p>
     <w:p>
@@ -4041,7 +4041,7 @@
           <w:szCs w:val="20"/>
           <w:lang w:val="nl-BE"/>
         </w:rPr>
-        <w:t xml:space="preserve">Op bepaalde momenten tijdens de studie vragen we u om gedurende één week een kleine </w:t>
+        <w:t xml:space="preserve">Bij de start van de studie vragen we u om gedurende één week een kleine </w:t>
       </w:r>
       <w:proofErr w:type="spellStart"/>
       <w:r>
@@ -4400,7 +4400,7 @@
           <w:szCs w:val="20"/>
           <w:lang w:val="nl-BE"/>
         </w:rPr>
-        <w:t>meten we na 6, 12 en 18 maanden opnieuw de druk onder uw voeten, met en zonder de steunzolen;</w:t>
+        <w:t>meten we opnieuw de druk onder uw voeten, met en zonder de steunzolen: na 6, 12 en 18 maanden in de groep die de PARADISE-aanpak ontvangt, en na 6 maanden in de andere groep;</w:t>
       </w:r>
       <w:proofErr w:type="gramEnd"/>
       <w:r>

</xml_diff>